<commit_message>
Update app and clean tracked generated files
</commit_message>
<xml_diff>
--- a/CAT-II CD QPP.docx
+++ b/CAT-II CD QPP.docx
@@ -105,15 +105,6 @@
               </w:rPr>
               <w:t xml:space="preserve"> CODE: </w:t>
             </w:r>
-            <w:r>
-              <w:rPr>
-                <w:rFonts w:ascii="Times New Roman" w:hAnsi="Times New Roman"/>
-                <w:b/>
-                <w:sz w:val="18"/>
-                <w:szCs w:val="18"/>
-              </w:rPr>
-              <w:t>EBCS22008</w:t>
-            </w:r>
           </w:p>
         </w:tc>
         <w:tc>
@@ -148,15 +139,6 @@
                 <w:szCs w:val="18"/>
               </w:rPr>
               <w:t>NAME:</w:t>
-            </w:r>
-            <w:r>
-              <w:rPr>
-                <w:rFonts w:ascii="Times New Roman" w:hAnsi="Times New Roman"/>
-                <w:b/>
-                <w:sz w:val="18"/>
-                <w:szCs w:val="18"/>
-              </w:rPr>
-              <w:t xml:space="preserve"> PRINCIPLES OF COMPILER DESIGN</w:t>
             </w:r>
           </w:p>
         </w:tc>
@@ -1204,13 +1186,13 @@
             </w:r>
             <w:r>
               <w:br/>
+              <w:t>B) N/A</w:t>
+            </w:r>
+            <w:r>
+              <w:br/>
             </w:r>
             <w:r>
               <w:lastRenderedPageBreak/>
-              <w:t>B) N/A</w:t>
-            </w:r>
-            <w:r>
-              <w:br/>
               <w:t>C) Use Hierarchical clustering algorithm instead of K-Means clustering.</w:t>
             </w:r>
             <w:r>
@@ -2251,7 +2233,6 @@
           <w:rFonts w:ascii="Times New Roman" w:eastAsia="Times New Roman" w:hAnsi="Times New Roman" w:cs="Times New Roman"/>
           <w:b/>
         </w:rPr>
-        <w:lastRenderedPageBreak/>
         <w:t>BL</w:t>
       </w:r>
       <w:r>
@@ -2312,6 +2293,7 @@
         <w:rPr>
           <w:rFonts w:ascii="Times New Roman" w:eastAsia="Times New Roman" w:hAnsi="Times New Roman" w:cs="Times New Roman"/>
         </w:rPr>
+        <w:lastRenderedPageBreak/>
         <w:t xml:space="preserve"> </w:t>
       </w:r>
       <w:r>
@@ -4033,7 +4015,6 @@
               <w:spacing w:after="0" w:line="240" w:lineRule="auto"/>
             </w:pPr>
             <w:r>
-              <w:lastRenderedPageBreak/>
               <w:t xml:space="preserve">DATE: </w:t>
             </w:r>
           </w:p>
@@ -4091,6 +4072,7 @@
               <w:rPr>
                 <w:b/>
               </w:rPr>
+              <w:lastRenderedPageBreak/>
               <w:t>Q. No</w:t>
             </w:r>
           </w:p>

</xml_diff>